<commit_message>
SCRUM-57 menambahkan dokumen backlog berisi nama dan nim Devita
</commit_message>
<xml_diff>
--- a/saya sebagai admin, ingin menambahkan nim pada nama devita agar setiap nama ada nim nya.docx
+++ b/saya sebagai admin, ingin menambahkan nim pada nama devita agar setiap nama ada nim nya.docx
@@ -57,13 +57,8 @@
       </w:r>
       <w:proofErr w:type="spellEnd"/>
       <w:r>
-        <w:t xml:space="preserve"> nim </w:t>
-      </w:r>
-      <w:proofErr w:type="spellStart"/>
-      <w:r>
-        <w:t>nya</w:t>
-      </w:r>
-      <w:proofErr w:type="spellEnd"/>
+        <w:t xml:space="preserve"> nim</w:t>
+      </w:r>
     </w:p>
     <w:sectPr>
       <w:pgSz w:w="11906" w:h="16838"/>

</xml_diff>